<commit_message>
Usuń pkt 2 z klauzuli i pozostaw tylko wersję wg wzoru
Co-Authored-By: Claude Sonnet 5.5 <noreply@anthropic.com>
Claude-Session: https://claude.ai/code/session_019GC9aK6s8md7WkZ87QpYCa
</commit_message>
<xml_diff>
--- a/Megalog_informacja_RODO_14.10.2026_wersja_wg_wzoru.docx
+++ b/Megalog_informacja_RODO_14.10.2026_wersja_wg_wzoru.docx
@@ -127,7 +127,79 @@
           <w:rFonts w:ascii="Century Gothic" w:hAnsi="Century Gothic"/>
           <w:sz w:val="22"/>
         </w:rPr>
-        <w:t xml:space="preserve">Administrator nie wyznaczył inspektora ochrony danych.</w:t>
+        <w:t xml:space="preserve">Dane osobowe reprezentantów, pełnomocników, pracowników i współpracowników NFOŚiGW oraz Spółki, wskazanych do wykonywania Umowy, przetwarzane są w związku z realizacją przedsięwzięcia pn. „Budowa stacji ładowania dla pojazdów kat. N2/N3 w bazie eksploatacyjnej MEGALOG sp. z o.o. w Ciechanowie przy ul. Tysiąclecia 1”, w celu:</w:t>
+      </w:r>
+    </w:p>
+    <w:p>
+      <w:pPr>
+        <w:spacing w:before="0" w:after="60" w:line="260" w:lineRule="auto"/>
+        <w:ind w:left="992" w:hanging="425"/>
+        <w:jc w:val="both"/>
+      </w:pPr>
+      <w:r>
+        <w:rPr>
+          <w:rFonts w:ascii="Century Gothic" w:hAnsi="Century Gothic"/>
+          <w:sz w:val="22"/>
+        </w:rPr>
+        <w:t xml:space="preserve">–</w:t>
+      </w:r>
+      <w:r>
+        <w:tab/>
+      </w:r>
+      <w:r>
+        <w:rPr>
+          <w:rFonts w:ascii="Century Gothic" w:hAnsi="Century Gothic"/>
+          <w:sz w:val="22"/>
+        </w:rPr>
+        <w:t xml:space="preserve">udokumentowania, wykonywania i rozliczania Umowy, w tym komunikowania się w jej sprawach, weryfikacji umocowania do działania w imieniu stron oraz realizacji obowiązków informacyjnych, sprawozdawczych i kontrolnych wynikających z Umowy,</w:t>
+      </w:r>
+    </w:p>
+    <w:p>
+      <w:pPr>
+        <w:spacing w:before="0" w:after="60" w:line="260" w:lineRule="auto"/>
+        <w:ind w:left="992" w:hanging="425"/>
+        <w:jc w:val="both"/>
+      </w:pPr>
+      <w:r>
+        <w:rPr>
+          <w:rFonts w:ascii="Century Gothic" w:hAnsi="Century Gothic"/>
+          <w:sz w:val="22"/>
+        </w:rPr>
+        <w:t xml:space="preserve">–</w:t>
+      </w:r>
+      <w:r>
+        <w:tab/>
+      </w:r>
+      <w:r>
+        <w:rPr>
+          <w:rFonts w:ascii="Century Gothic" w:hAnsi="Century Gothic"/>
+          <w:sz w:val="22"/>
+        </w:rPr>
+        <w:t xml:space="preserve">wypełnienia obowiązków prawnych ciążących na Administratorze, w szczególności podatkowych i rachunkowych, w tym archiwizacji dokumentacji związanej z Umową,</w:t>
+      </w:r>
+    </w:p>
+    <w:p>
+      <w:pPr>
+        <w:spacing w:before="0" w:after="60" w:line="260" w:lineRule="auto"/>
+        <w:ind w:left="992" w:hanging="425"/>
+        <w:jc w:val="both"/>
+      </w:pPr>
+      <w:r>
+        <w:rPr>
+          <w:rFonts w:ascii="Century Gothic" w:hAnsi="Century Gothic"/>
+          <w:sz w:val="22"/>
+        </w:rPr>
+        <w:t xml:space="preserve">–</w:t>
+      </w:r>
+      <w:r>
+        <w:tab/>
+      </w:r>
+      <w:r>
+        <w:rPr>
+          <w:rFonts w:ascii="Century Gothic" w:hAnsi="Century Gothic"/>
+          <w:sz w:val="22"/>
+        </w:rPr>
+        <w:t xml:space="preserve">ustalenia, dochodzenia lub obrony roszczeń związanych z Umową.</w:t>
       </w:r>
     </w:p>
     <w:p>
@@ -151,7 +223,7 @@
           <w:rFonts w:ascii="Century Gothic" w:hAnsi="Century Gothic"/>
           <w:sz w:val="22"/>
         </w:rPr>
-        <w:t xml:space="preserve">Dane osobowe reprezentantów, pełnomocników, pracowników i współpracowników NFOŚiGW oraz Spółki, wskazanych do wykonywania Umowy, przetwarzane są w związku z realizacją przedsięwzięcia pn. „Budowa stacji ładowania dla pojazdów kat. N2/N3 w bazie eksploatacyjnej MEGALOG sp. z o.o. w Ciechanowie przy ul. Tysiąclecia 1”, w celu:</w:t>
+        <w:t xml:space="preserve">Podstawą przetwarzania danych osobowych jest:</w:t>
       </w:r>
     </w:p>
     <w:p>
@@ -175,7 +247,7 @@
           <w:rFonts w:ascii="Century Gothic" w:hAnsi="Century Gothic"/>
           <w:sz w:val="22"/>
         </w:rPr>
-        <w:t xml:space="preserve">udokumentowania, wykonywania i rozliczania Umowy, w tym komunikowania się w jej sprawach, weryfikacji umocowania do działania w imieniu stron oraz realizacji obowiązków informacyjnych, sprawozdawczych i kontrolnych wynikających z Umowy,</w:t>
+        <w:t xml:space="preserve">art. 6 ust. 1 lit. f RODO – prawnie uzasadniony interes Administratora polegający na prawidłowym wykonaniu Umowy oraz na możliwości ustalenia, dochodzenia lub obrony roszczeń,</w:t>
       </w:r>
     </w:p>
     <w:p>
@@ -199,31 +271,7 @@
           <w:rFonts w:ascii="Century Gothic" w:hAnsi="Century Gothic"/>
           <w:sz w:val="22"/>
         </w:rPr>
-        <w:t xml:space="preserve">wypełnienia obowiązków prawnych ciążących na Administratorze, w szczególności podatkowych i rachunkowych, w tym archiwizacji dokumentacji związanej z Umową,</w:t>
-      </w:r>
-    </w:p>
-    <w:p>
-      <w:pPr>
-        <w:spacing w:before="0" w:after="60" w:line="260" w:lineRule="auto"/>
-        <w:ind w:left="992" w:hanging="425"/>
-        <w:jc w:val="both"/>
-      </w:pPr>
-      <w:r>
-        <w:rPr>
-          <w:rFonts w:ascii="Century Gothic" w:hAnsi="Century Gothic"/>
-          <w:sz w:val="22"/>
-        </w:rPr>
-        <w:t xml:space="preserve">–</w:t>
-      </w:r>
-      <w:r>
-        <w:tab/>
-      </w:r>
-      <w:r>
-        <w:rPr>
-          <w:rFonts w:ascii="Century Gothic" w:hAnsi="Century Gothic"/>
-          <w:sz w:val="22"/>
-        </w:rPr>
-        <w:t xml:space="preserve">ustalenia, dochodzenia lub obrony roszczeń związanych z Umową.</w:t>
+        <w:t xml:space="preserve">art. 6 ust. 1 lit. c RODO – niezbędność wypełnienia przez Administratora obowiązku prawnego wynikającego z przepisów podatkowych i o rachunkowości (w szczególności ustawy z dnia 29 sierpnia 1997 r. – Ordynacja podatkowa oraz ustawy z dnia 29 września 1994 r. o rachunkowości).</w:t>
       </w:r>
     </w:p>
     <w:p>
@@ -247,55 +295,7 @@
           <w:rFonts w:ascii="Century Gothic" w:hAnsi="Century Gothic"/>
           <w:sz w:val="22"/>
         </w:rPr>
-        <w:t xml:space="preserve">Podstawą przetwarzania danych osobowych jest:</w:t>
-      </w:r>
-    </w:p>
-    <w:p>
-      <w:pPr>
-        <w:spacing w:before="0" w:after="60" w:line="260" w:lineRule="auto"/>
-        <w:ind w:left="992" w:hanging="425"/>
-        <w:jc w:val="both"/>
-      </w:pPr>
-      <w:r>
-        <w:rPr>
-          <w:rFonts w:ascii="Century Gothic" w:hAnsi="Century Gothic"/>
-          <w:sz w:val="22"/>
-        </w:rPr>
-        <w:t xml:space="preserve">–</w:t>
-      </w:r>
-      <w:r>
-        <w:tab/>
-      </w:r>
-      <w:r>
-        <w:rPr>
-          <w:rFonts w:ascii="Century Gothic" w:hAnsi="Century Gothic"/>
-          <w:sz w:val="22"/>
-        </w:rPr>
-        <w:t xml:space="preserve">art. 6 ust. 1 lit. f RODO – prawnie uzasadniony interes Administratora polegający na prawidłowym wykonaniu Umowy oraz na możliwości ustalenia, dochodzenia lub obrony roszczeń,</w:t>
-      </w:r>
-    </w:p>
-    <w:p>
-      <w:pPr>
-        <w:spacing w:before="0" w:after="60" w:line="260" w:lineRule="auto"/>
-        <w:ind w:left="992" w:hanging="425"/>
-        <w:jc w:val="both"/>
-      </w:pPr>
-      <w:r>
-        <w:rPr>
-          <w:rFonts w:ascii="Century Gothic" w:hAnsi="Century Gothic"/>
-          <w:sz w:val="22"/>
-        </w:rPr>
-        <w:t xml:space="preserve">–</w:t>
-      </w:r>
-      <w:r>
-        <w:tab/>
-      </w:r>
-      <w:r>
-        <w:rPr>
-          <w:rFonts w:ascii="Century Gothic" w:hAnsi="Century Gothic"/>
-          <w:sz w:val="22"/>
-        </w:rPr>
-        <w:t xml:space="preserve">art. 6 ust. 1 lit. c RODO – niezbędność wypełnienia przez Administratora obowiązku prawnego wynikającego z przepisów podatkowych i o rachunkowości (w szczególności ustawy z dnia 29 sierpnia 1997 r. – Ordynacja podatkowa oraz ustawy z dnia 29 września 1994 r. o rachunkowości).</w:t>
+        <w:t xml:space="preserve">Administrator przetwarza następujące kategorie danych osobowych: imię i nazwisko, stanowisko lub pełnioną funkcję, służbowe dane kontaktowe (adres e-mail, numer telefonu), podpis lub kwalifikowany podpis elektroniczny oraz dane dotyczące umocowania do działania w imieniu strony Umowy. Dane pochodzą od NFOŚiGW (w odniesieniu do jego reprezentantów, pracowników i współpracowników), bezpośrednio od osoby, której dotyczą (w odniesieniu do reprezentantów, pracowników i współpracowników Spółki), oraz z publicznie dostępnych rejestrów (w szczególności Krajowego Rejestru Sądowego).</w:t>
       </w:r>
     </w:p>
     <w:p>
@@ -319,7 +319,7 @@
           <w:rFonts w:ascii="Century Gothic" w:hAnsi="Century Gothic"/>
           <w:sz w:val="22"/>
         </w:rPr>
-        <w:t xml:space="preserve">Administrator przetwarza następujące kategorie danych osobowych: imię i nazwisko, stanowisko lub pełnioną funkcję, służbowe dane kontaktowe (adres e-mail, numer telefonu), podpis lub kwalifikowany podpis elektroniczny oraz dane dotyczące umocowania do działania w imieniu strony Umowy. Dane pochodzą od NFOŚiGW (w odniesieniu do jego reprezentantów, pracowników i współpracowników), bezpośrednio od osoby, której dotyczą (w odniesieniu do reprezentantów, pracowników i współpracowników Spółki), oraz z publicznie dostępnych rejestrów (w szczególności Krajowego Rejestru Sądowego).</w:t>
+        <w:t xml:space="preserve">Dane osobowe będą udostępniane NFOŚiGW jako stronie Umowy oraz podmiotom uprawnionym do kontroli lub audytu wykorzystania dofinansowania, w tym instytucjom kontrolnym i audytowym krajowym oraz Unii Europejskiej, a także innym podmiotom, jeżeli wynika to z realizacji uprawnienia lub obowiązku określonego w przepisach prawa. Administrator powierza przetwarzanie danych osobowych podmiotom świadczącym na jego rzecz usługi informatyczne, księgowo-finansowe i prawne na podstawie umów powierzenia i wyłącznie zgodnie z jego poleceniami. Dane mogą być również udostępniane operatorom pocztowym i firmom kurierskim.</w:t>
       </w:r>
     </w:p>
     <w:p>
@@ -343,7 +343,7 @@
           <w:rFonts w:ascii="Century Gothic" w:hAnsi="Century Gothic"/>
           <w:sz w:val="22"/>
         </w:rPr>
-        <w:t xml:space="preserve">Dane osobowe będą udostępniane NFOŚiGW jako stronie Umowy oraz podmiotom uprawnionym do kontroli lub audytu wykorzystania dofinansowania, w tym instytucjom kontrolnym i audytowym krajowym oraz Unii Europejskiej, a także innym podmiotom, jeżeli wynika to z realizacji uprawnienia lub obowiązku określonego w przepisach prawa. Administrator powierza przetwarzanie danych osobowych podmiotom świadczącym na jego rzecz usługi informatyczne, księgowo-finansowe i prawne na podstawie umów powierzenia i wyłącznie zgodnie z jego poleceniami. Dane mogą być również udostępniane operatorom pocztowym i firmom kurierskim.</w:t>
+        <w:t xml:space="preserve">Dane osobowe nie będą przekazywane do państw trzecich ani organizacji międzynarodowych.</w:t>
       </w:r>
     </w:p>
     <w:p>
@@ -367,7 +367,7 @@
           <w:rFonts w:ascii="Century Gothic" w:hAnsi="Century Gothic"/>
           <w:sz w:val="22"/>
         </w:rPr>
-        <w:t xml:space="preserve">Dane osobowe nie będą przekazywane do państw trzecich ani organizacji międzynarodowych.</w:t>
+        <w:t xml:space="preserve">Dane osobowe będą przechowywane w okresie wykonywania Umowy, obejmującym okres trwałości inwestycji określony w Umowie, a następnie przez okres wymagany przepisami prawa, w szczególności przepisami podatkowymi i o rachunkowości (co do zasady 5 lat liczonych od końca roku kalendarzowego, w którym powstał obowiązek podatkowy lub zakończono rok obrotowy, w którym operacja została ostatecznie rozliczona), a w zakresie ustalenia, dochodzenia lub obrony roszczeń – do upływu terminu ich przedawnienia.</w:t>
       </w:r>
     </w:p>
     <w:p>
@@ -391,7 +391,7 @@
           <w:rFonts w:ascii="Century Gothic" w:hAnsi="Century Gothic"/>
           <w:sz w:val="22"/>
         </w:rPr>
-        <w:t xml:space="preserve">Dane osobowe będą przechowywane w okresie wykonywania Umowy, obejmującym okres trwałości inwestycji określony w Umowie, a następnie przez okres wymagany przepisami prawa, w szczególności przepisami podatkowymi i o rachunkowości (co do zasady 5 lat liczonych od końca roku kalendarzowego, w którym powstał obowiązek podatkowy lub zakończono rok obrotowy, w którym operacja została ostatecznie rozliczona), a w zakresie ustalenia, dochodzenia lub obrony roszczeń – do upływu terminu ich przedawnienia.</w:t>
+        <w:t xml:space="preserve">Osobie, której dane są przetwarzane, przysługuje prawo żądania od Administratora dostępu do danych osobowych jej dotyczących (art. 15 RODO), ich sprostowania (art. 16 RODO), usunięcia (art. 17 RODO) lub ograniczenia przetwarzania (art. 18 RODO) – na warunkach określonych w tych przepisach. Prawa te można zrealizować, pisząc na adres e-mail: info@megalog.pl.</w:t>
       </w:r>
     </w:p>
     <w:p>
@@ -413,9 +413,10 @@
       <w:r>
         <w:rPr>
           <w:rFonts w:ascii="Century Gothic" w:hAnsi="Century Gothic"/>
-          <w:sz w:val="22"/>
-        </w:rPr>
-        <w:t xml:space="preserve">Osobie, której dane są przetwarzane, przysługuje prawo żądania od Administratora dostępu do danych osobowych jej dotyczących (art. 15 RODO), ich sprostowania (art. 16 RODO), usunięcia (art. 17 RODO) lub ograniczenia przetwarzania (art. 18 RODO) – na warunkach określonych w tych przepisach. Prawa te można zrealizować, pisząc na adres e-mail: info@megalog.pl.</w:t>
+          <w:b/>
+          <w:sz w:val="22"/>
+        </w:rPr>
+        <w:t xml:space="preserve">Osobie, której dane są przetwarzane, przysługuje prawo wniesienia sprzeciwu wobec przetwarzania danych ze względu na jej szczególną sytuację (art. 21 RODO), w zakresie, w jakim dane przetwarzane są na podstawie prawnie uzasadnionego interesu Administratora (art. 6 ust. 1 lit. f RODO).</w:t>
       </w:r>
     </w:p>
     <w:p>
@@ -437,10 +438,9 @@
       <w:r>
         <w:rPr>
           <w:rFonts w:ascii="Century Gothic" w:hAnsi="Century Gothic"/>
-          <w:b/>
-          <w:sz w:val="22"/>
-        </w:rPr>
-        <w:t xml:space="preserve">Osobie, której dane są przetwarzane, przysługuje prawo wniesienia sprzeciwu wobec przetwarzania danych ze względu na jej szczególną sytuację (art. 21 RODO), w zakresie, w jakim dane przetwarzane są na podstawie prawnie uzasadnionego interesu Administratora (art. 6 ust. 1 lit. f RODO).</w:t>
+          <w:sz w:val="22"/>
+        </w:rPr>
+        <w:t xml:space="preserve">Osobie, której dane są przetwarzane, przysługuje prawo wniesienia skargi do Prezesa Urzędu Ochrony Danych Osobowych (ul. Stawki 2, 00-193 Warszawa) lub do organu nadzorczego innego państwa członkowskiego Unii Europejskiej, właściwego ze względu na miejsce zwykłego pobytu lub pracy lub miejsce domniemanego naruszenia RODO.</w:t>
       </w:r>
     </w:p>
     <w:p>
@@ -464,7 +464,7 @@
           <w:rFonts w:ascii="Century Gothic" w:hAnsi="Century Gothic"/>
           <w:sz w:val="22"/>
         </w:rPr>
-        <w:t xml:space="preserve">Osobie, której dane są przetwarzane, przysługuje prawo wniesienia skargi do Prezesa Urzędu Ochrony Danych Osobowych (ul. Stawki 2, 00-193 Warszawa) lub do organu nadzorczego innego państwa członkowskiego Unii Europejskiej, właściwego ze względu na miejsce zwykłego pobytu lub pracy lub miejsce domniemanego naruszenia RODO.</w:t>
+        <w:t xml:space="preserve">Dane osobowe nie będą przedmiotem zautomatyzowanego podejmowania decyzji, w tym profilowania, o którym mowa w art. 22 ust. 1 i 4 RODO.</w:t>
       </w:r>
     </w:p>
     <w:p>
@@ -479,30 +479,6 @@
           <w:sz w:val="22"/>
         </w:rPr>
         <w:t xml:space="preserve">12.</w:t>
-      </w:r>
-      <w:r>
-        <w:tab/>
-      </w:r>
-      <w:r>
-        <w:rPr>
-          <w:rFonts w:ascii="Century Gothic" w:hAnsi="Century Gothic"/>
-          <w:sz w:val="22"/>
-        </w:rPr>
-        <w:t xml:space="preserve">Dane osobowe nie będą przedmiotem zautomatyzowanego podejmowania decyzji, w tym profilowania, o którym mowa w art. 22 ust. 1 i 4 RODO.</w:t>
-      </w:r>
-    </w:p>
-    <w:p>
-      <w:pPr>
-        <w:spacing w:before="0" w:after="120" w:line="260" w:lineRule="auto"/>
-        <w:ind w:left="567" w:hanging="425"/>
-        <w:jc w:val="both"/>
-      </w:pPr>
-      <w:r>
-        <w:rPr>
-          <w:rFonts w:ascii="Century Gothic" w:hAnsi="Century Gothic"/>
-          <w:sz w:val="22"/>
-        </w:rPr>
-        <w:t xml:space="preserve">13.</w:t>
       </w:r>
       <w:r>
         <w:tab/>

</xml_diff>